<commit_message>
fix(media): enforce owned asset lifecycle
</commit_message>
<xml_diff>
--- a/Thrift_Kro_Backend_Documentation.docx
+++ b/Thrift_Kro_Backend_Documentation.docx
@@ -202,7 +202,7 @@
               <w:rPr>
                 <w:sz w:val="18"/>
               </w:rPr>
-              <w:t>16 October 2026</w:t>
+              <w:t>18 October 2026</w:t>
             </w:r>
           </w:p>
         </w:tc>
@@ -253,7 +253,7 @@
               <w:rPr>
                 <w:sz w:val="18"/>
               </w:rPr>
-              <w:t>20261016_14</w:t>
+              <w:t>20261018_15</w:t>
             </w:r>
           </w:p>
         </w:tc>
@@ -2318,7 +2318,7 @@
               <w:rPr>
                 <w:sz w:val="18"/>
               </w:rPr>
-              <w:t>categories, products, product_images, product_variants, product_tags, verification_logs</w:t>
+              <w:t>categories, products, product_images, media_assets, product_variants, product_tags, verification_logs</w:t>
             </w:r>
           </w:p>
         </w:tc>
@@ -2584,6 +2584,24 @@
       </w:pPr>
       <w:r>
         <w:t>Inventory decrements occur under row locks after quantities are aggregated by variant.</w:t>
+      </w:r>
+    </w:p>
+    <w:p>
+      <w:pPr>
+        <w:pStyle w:val="ListBullet"/>
+        <w:spacing w:after="60"/>
+      </w:pPr>
+      <w:r>
+        <w:t>Uploaded product images must resolve to a pending media asset owned by the same seller.</w:t>
+      </w:r>
+    </w:p>
+    <w:p>
+      <w:pPr>
+        <w:pStyle w:val="ListBullet"/>
+        <w:spacing w:after="60"/>
+      </w:pPr>
+      <w:r>
+        <w:t>Unattached uploads expire after 24 hours; soft deleted product media is retained for 30 days before provider cleanup.</w:t>
       </w:r>
     </w:p>
     <w:p>
@@ -3805,7 +3823,7 @@
               <w:rPr>
                 <w:sz w:val="18"/>
               </w:rPr>
-              <w:t>Authenticated validated image upload</w:t>
+              <w:t>Managed, validated seller-owned product image upload</w:t>
             </w:r>
           </w:p>
         </w:tc>
@@ -5099,7 +5117,7 @@
         <w:spacing w:after="60"/>
       </w:pPr>
       <w:r>
-        <w:t>Treat AI, VTON, and card functionality as unavailable unless a separately reviewed release changes that boundary.</w:t>
+        <w:t>Treat AI, VTON, and card functionality as unavailable until separately reviewed for release.</w:t>
       </w:r>
     </w:p>
     <w:p>

</xml_diff>